<commit_message>
fix-by-acceptance: enforce output run fonts
</commit_message>
<xml_diff>
--- a/packages/output/test/manual-verification/sample-redline.docx
+++ b/packages/output/test/manual-verification/sample-redline.docx
@@ -8,6 +8,7 @@
       </w:pPr>
       <w:r>
         <w:rPr>
+          <w:rFonts w:ascii="Times New Roman" w:eastAsia="黑体" w:hAnsi="Times New Roman" w:cs="Times New Roman"/>
           <w:b/>
           <w:sz w:val="32"/>
         </w:rPr>
@@ -17,38 +18,45 @@
     <w:p>
       <w:r>
         <w:rPr>
-          <w:rFonts w:ascii="Times New Roman" w:eastAsia="仿宋_GB2312" w:hAnsi="Times New Roman"/>
+          <w:rFonts w:ascii="Times New Roman" w:eastAsia="仿宋_GB2312" w:hAnsi="Times New Roman" w:cs="Times New Roman"/>
         </w:rPr>
         <w:t xml:space="preserve">甲方（买受人）：星辰科技</w:t>
       </w:r>
       <w:commentRangeStart w:id="8"/>
-      <w:ins w:id="1013" w:author="Courtwork" w:date="2026-07-09T10:00:00.000Z">
+      <w:ins w:id="1013" w:author="Courtwork" w:date="2026-07-09T00:00:00.000Z">
         <w:r>
           <w:rPr>
-            <w:rFonts w:ascii="Times New Roman" w:eastAsia="仿宋_GB2312" w:hAnsi="Times New Roman"/>
+            <w:rFonts w:ascii="Times New Roman" w:eastAsia="仿宋_GB2312" w:hAnsi="Times New Roman" w:cs="Times New Roman"/>
           </w:rPr>
           <w:t xml:space="preserve">股份</w:t>
         </w:r>
       </w:ins>
       <w:commentRangeEnd w:id="8"/>
       <w:r>
+        <w:rPr>
+          <w:rFonts w:ascii="Times New Roman" w:eastAsia="仿宋_GB2312" w:hAnsi="Times New Roman" w:cs="Times New Roman"/>
+        </w:rPr>
         <w:commentReference w:id="8"/>
       </w:r>
       <w:r>
         <w:rPr>
-          <w:rFonts w:ascii="Times New Roman" w:eastAsia="仿宋_GB2312" w:hAnsi="Times New Roman"/>
+          <w:rFonts w:ascii="Times New Roman" w:eastAsia="仿宋_GB2312" w:hAnsi="Times New Roman" w:cs="Times New Roman"/>
         </w:rPr>
         <w:t xml:space="preserve">有限公司</w:t>
       </w:r>
     </w:p>
     <w:p>
       <w:r>
+        <w:rPr>
+          <w:rFonts w:ascii="Times New Roman" w:eastAsia="仿宋_GB2312" w:hAnsi="Times New Roman" w:cs="Times New Roman"/>
+        </w:rPr>
         <w:t>乙方（出卖人）：恒源贸易有限公司</w:t>
       </w:r>
     </w:p>
     <w:p>
       <w:r>
         <w:rPr>
+          <w:rFonts w:ascii="Times New Roman" w:eastAsia="黑体" w:hAnsi="Times New Roman" w:cs="Times New Roman"/>
           <w:b/>
         </w:rPr>
         <w:t>第一条 标的物</w:t>
@@ -57,16 +65,23 @@
     <w:p>
       <w:commentRangeStart w:id="6"/>
       <w:r>
+        <w:rPr>
+          <w:rFonts w:ascii="Times New Roman" w:eastAsia="仿宋_GB2312" w:hAnsi="Times New Roman" w:cs="Times New Roman"/>
+        </w:rPr>
         <w:t>乙方向甲方出售办公设备一批，规格、数量、单价详见本合同附表一。</w:t>
       </w:r>
       <w:commentRangeEnd w:id="6"/>
       <w:r>
+        <w:rPr>
+          <w:rFonts w:ascii="Times New Roman" w:eastAsia="仿宋_GB2312" w:hAnsi="Times New Roman" w:cs="Times New Roman"/>
+        </w:rPr>
         <w:commentReference w:id="6"/>
       </w:r>
     </w:p>
     <w:p>
       <w:r>
         <w:rPr>
+          <w:rFonts w:ascii="Times New Roman" w:eastAsia="黑体" w:hAnsi="Times New Roman" w:cs="Times New Roman"/>
           <w:b/>
         </w:rPr>
         <w:t>第二条 价款</w:t>
@@ -74,12 +89,16 @@
     </w:p>
     <w:p>
       <w:r>
+        <w:rPr>
+          <w:rFonts w:ascii="Times New Roman" w:eastAsia="仿宋_GB2312" w:hAnsi="Times New Roman" w:cs="Times New Roman"/>
+        </w:rPr>
         <w:t>本合同总价款为人民币叁拾万元整（￥300,000.00）。</w:t>
       </w:r>
     </w:p>
     <w:p>
       <w:r>
         <w:rPr>
+          <w:rFonts w:ascii="Times New Roman" w:eastAsia="黑体" w:hAnsi="Times New Roman" w:cs="Times New Roman"/>
           <w:b/>
         </w:rPr>
         <w:t>第三条 交付期限</w:t>
@@ -88,34 +107,37 @@
     <w:p>
       <w:r>
         <w:rPr>
-          <w:rFonts w:ascii="Times New Roman" w:eastAsia="仿宋_GB2312" w:hAnsi="Times New Roman"/>
+          <w:rFonts w:ascii="Times New Roman" w:eastAsia="仿宋_GB2312" w:hAnsi="Times New Roman" w:cs="Times New Roman"/>
         </w:rPr>
         <w:t xml:space="preserve">乙方应于本合同签订之日起</w:t>
       </w:r>
-      <w:del w:id="1011" w:author="Courtwork" w:date="2026-07-09T10:00:00.000Z">
+      <w:del w:id="1011" w:author="Courtwork" w:date="2026-07-09T00:00:00.000Z">
         <w:r>
           <w:rPr>
-            <w:rFonts w:ascii="Times New Roman" w:eastAsia="仿宋_GB2312" w:hAnsi="Times New Roman"/>
+            <w:rFonts w:ascii="Times New Roman" w:eastAsia="仿宋_GB2312" w:hAnsi="Times New Roman" w:cs="Times New Roman"/>
           </w:rPr>
           <w:delText xml:space="preserve">三十</w:delText>
         </w:r>
       </w:del>
       <w:commentRangeStart w:id="7"/>
-      <w:ins w:id="1012" w:author="Courtwork" w:date="2026-07-09T10:00:00.000Z">
+      <w:ins w:id="1012" w:author="Courtwork" w:date="2026-07-09T00:00:00.000Z">
         <w:r>
           <w:rPr>
-            <w:rFonts w:ascii="Times New Roman" w:eastAsia="仿宋_GB2312" w:hAnsi="Times New Roman"/>
+            <w:rFonts w:ascii="Times New Roman" w:eastAsia="仿宋_GB2312" w:hAnsi="Times New Roman" w:cs="Times New Roman"/>
           </w:rPr>
           <w:t xml:space="preserve">四十五</w:t>
         </w:r>
       </w:ins>
       <w:commentRangeEnd w:id="7"/>
       <w:r>
+        <w:rPr>
+          <w:rFonts w:ascii="Times New Roman" w:eastAsia="仿宋_GB2312" w:hAnsi="Times New Roman" w:cs="Times New Roman"/>
+        </w:rPr>
         <w:commentReference w:id="7"/>
       </w:r>
       <w:r>
         <w:rPr>
-          <w:rFonts w:ascii="Times New Roman" w:eastAsia="仿宋_GB2312" w:hAnsi="Times New Roman"/>
+          <w:rFonts w:ascii="Times New Roman" w:eastAsia="仿宋_GB2312" w:hAnsi="Times New Roman" w:cs="Times New Roman"/>
         </w:rPr>
         <w:t xml:space="preserve">日内将标的物交付至甲方指定地点。</w:t>
       </w:r>
@@ -123,6 +145,7 @@
     <w:p>
       <w:r>
         <w:rPr>
+          <w:rFonts w:ascii="Times New Roman" w:eastAsia="黑体" w:hAnsi="Times New Roman" w:cs="Times New Roman"/>
           <w:b/>
         </w:rPr>
         <w:t>第四条 付款方式</w:t>
@@ -130,6 +153,9 @@
     </w:p>
     <w:p>
       <w:r>
+        <w:rPr>
+          <w:rFonts w:ascii="Times New Roman" w:eastAsia="仿宋_GB2312" w:hAnsi="Times New Roman" w:cs="Times New Roman"/>
+        </w:rPr>
         <w:t>甲方应按照下表约定的进度支付价款：</w:t>
       </w:r>
     </w:p>
@@ -151,6 +177,9 @@
           </w:tcPr>
           <w:p>
             <w:r>
+              <w:rPr>
+                <w:rFonts w:ascii="Times New Roman" w:eastAsia="仿宋_GB2312" w:hAnsi="Times New Roman" w:cs="Times New Roman"/>
+              </w:rPr>
               <w:t>期数</w:t>
             </w:r>
           </w:p>
@@ -161,6 +190,9 @@
           </w:tcPr>
           <w:p>
             <w:r>
+              <w:rPr>
+                <w:rFonts w:ascii="Times New Roman" w:eastAsia="仿宋_GB2312" w:hAnsi="Times New Roman" w:cs="Times New Roman"/>
+              </w:rPr>
               <w:t>支付比例</w:t>
             </w:r>
           </w:p>
@@ -171,6 +203,9 @@
           </w:tcPr>
           <w:p>
             <w:r>
+              <w:rPr>
+                <w:rFonts w:ascii="Times New Roman" w:eastAsia="仿宋_GB2312" w:hAnsi="Times New Roman" w:cs="Times New Roman"/>
+              </w:rPr>
               <w:t>支付时间</w:t>
             </w:r>
           </w:p>
@@ -183,6 +218,9 @@
           </w:tcPr>
           <w:p>
             <w:r>
+              <w:rPr>
+                <w:rFonts w:ascii="Times New Roman" w:eastAsia="仿宋_GB2312" w:hAnsi="Times New Roman" w:cs="Times New Roman"/>
+              </w:rPr>
               <w:t>第一期</w:t>
             </w:r>
           </w:p>
@@ -192,30 +230,33 @@
             <w:tcW w:type="dxa" w:w="2880"/>
           </w:tcPr>
           <w:p>
-            <w:del w:id="1005" w:author="Courtwork" w:date="2026-07-09T10:00:00.000Z">
+            <w:del w:id="1005" w:author="Courtwork" w:date="2026-07-09T00:00:00.000Z">
               <w:r>
                 <w:rPr>
-                  <w:rFonts w:ascii="Times New Roman" w:eastAsia="仿宋_GB2312" w:hAnsi="Times New Roman"/>
+                  <w:rFonts w:ascii="Times New Roman" w:eastAsia="仿宋_GB2312" w:hAnsi="Times New Roman" w:cs="Times New Roman"/>
                 </w:rPr>
                 <w:delText xml:space="preserve">3</w:delText>
               </w:r>
             </w:del>
             <w:commentRangeStart w:id="3"/>
-            <w:ins w:id="1006" w:author="Courtwork" w:date="2026-07-09T10:00:00.000Z">
+            <w:ins w:id="1006" w:author="Courtwork" w:date="2026-07-09T00:00:00.000Z">
               <w:r>
                 <w:rPr>
-                  <w:rFonts w:ascii="Times New Roman" w:eastAsia="仿宋_GB2312" w:hAnsi="Times New Roman"/>
+                  <w:rFonts w:ascii="Times New Roman" w:eastAsia="仿宋_GB2312" w:hAnsi="Times New Roman" w:cs="Times New Roman"/>
                 </w:rPr>
                 <w:t xml:space="preserve">2</w:t>
               </w:r>
             </w:ins>
             <w:commentRangeEnd w:id="3"/>
             <w:r>
+              <w:rPr>
+                <w:rFonts w:ascii="Times New Roman" w:eastAsia="仿宋_GB2312" w:hAnsi="Times New Roman" w:cs="Times New Roman"/>
+              </w:rPr>
               <w:commentReference w:id="3"/>
             </w:r>
             <w:r>
               <w:rPr>
-                <w:rFonts w:ascii="Times New Roman" w:eastAsia="仿宋_GB2312" w:hAnsi="Times New Roman"/>
+                <w:rFonts w:ascii="Times New Roman" w:eastAsia="仿宋_GB2312" w:hAnsi="Times New Roman" w:cs="Times New Roman"/>
               </w:rPr>
               <w:t xml:space="preserve">0%</w:t>
             </w:r>
@@ -227,6 +268,9 @@
           </w:tcPr>
           <w:p>
             <w:r>
+              <w:rPr>
+                <w:rFonts w:ascii="Times New Roman" w:eastAsia="仿宋_GB2312" w:hAnsi="Times New Roman" w:cs="Times New Roman"/>
+              </w:rPr>
               <w:t>合同签订之日起3日内</w:t>
             </w:r>
           </w:p>
@@ -239,6 +283,9 @@
           </w:tcPr>
           <w:p>
             <w:r>
+              <w:rPr>
+                <w:rFonts w:ascii="Times New Roman" w:eastAsia="仿宋_GB2312" w:hAnsi="Times New Roman" w:cs="Times New Roman"/>
+              </w:rPr>
               <w:t>第二期</w:t>
             </w:r>
           </w:p>
@@ -249,6 +296,9 @@
           </w:tcPr>
           <w:p>
             <w:r>
+              <w:rPr>
+                <w:rFonts w:ascii="Times New Roman" w:eastAsia="仿宋_GB2312" w:hAnsi="Times New Roman" w:cs="Times New Roman"/>
+              </w:rPr>
               <w:t>40%</w:t>
             </w:r>
           </w:p>
@@ -259,6 +309,9 @@
           </w:tcPr>
           <w:p>
             <w:r>
+              <w:rPr>
+                <w:rFonts w:ascii="Times New Roman" w:eastAsia="仿宋_GB2312" w:hAnsi="Times New Roman" w:cs="Times New Roman"/>
+              </w:rPr>
               <w:t>标的物交付之日起5日内</w:t>
             </w:r>
           </w:p>
@@ -266,7 +319,7 @@
       </w:tr>
       <w:tr>
         <w:trPr>
-          <w:del w:id="1014" w:author="Courtwork" w:date="2026-07-09T10:00:00.000Z"/>
+          <w:del w:id="1014" w:author="Courtwork" w:date="2026-07-09T00:00:00.000Z"/>
         </w:trPr>
         <w:tc>
           <w:tcPr>
@@ -276,19 +329,22 @@
             <w:commentRangeStart w:id="9"/>
             <w:pPr>
               <w:rPr>
-                <w:del w:id="1016" w:author="Courtwork" w:date="2026-07-09T10:00:00.000Z"/>
+                <w:del w:id="1016" w:author="Courtwork" w:date="2026-07-09T00:00:00.000Z"/>
               </w:rPr>
             </w:pPr>
-            <w:del w:id="1015" w:author="Courtwork" w:date="2026-07-09T10:00:00.000Z">
+            <w:del w:id="1015" w:author="Courtwork" w:date="2026-07-09T00:00:00.000Z">
               <w:r>
                 <w:rPr>
-                  <w:rFonts w:ascii="Times New Roman" w:eastAsia="仿宋_GB2312" w:hAnsi="Times New Roman"/>
+                  <w:rFonts w:ascii="Times New Roman" w:eastAsia="仿宋_GB2312" w:hAnsi="Times New Roman" w:cs="Times New Roman"/>
                 </w:rPr>
                 <w:delText xml:space="preserve">第三期</w:delText>
               </w:r>
             </w:del>
             <w:commentRangeEnd w:id="9"/>
             <w:r>
+              <w:rPr>
+                <w:rFonts w:ascii="Times New Roman" w:eastAsia="仿宋_GB2312" w:hAnsi="Times New Roman" w:cs="Times New Roman"/>
+              </w:rPr>
               <w:commentReference w:id="9"/>
             </w:r>
           </w:p>
@@ -300,13 +356,13 @@
           <w:p>
             <w:pPr>
               <w:rPr>
-                <w:del w:id="1018" w:author="Courtwork" w:date="2026-07-09T10:00:00.000Z"/>
+                <w:del w:id="1018" w:author="Courtwork" w:date="2026-07-09T00:00:00.000Z"/>
               </w:rPr>
             </w:pPr>
-            <w:del w:id="1017" w:author="Courtwork" w:date="2026-07-09T10:00:00.000Z">
+            <w:del w:id="1017" w:author="Courtwork" w:date="2026-07-09T00:00:00.000Z">
               <w:r>
                 <w:rPr>
-                  <w:rFonts w:ascii="Times New Roman" w:eastAsia="仿宋_GB2312" w:hAnsi="Times New Roman"/>
+                  <w:rFonts w:ascii="Times New Roman" w:eastAsia="仿宋_GB2312" w:hAnsi="Times New Roman" w:cs="Times New Roman"/>
                 </w:rPr>
                 <w:delText xml:space="preserve">30%</w:delText>
               </w:r>
@@ -320,13 +376,13 @@
           <w:p>
             <w:pPr>
               <w:rPr>
-                <w:del w:id="1020" w:author="Courtwork" w:date="2026-07-09T10:00:00.000Z"/>
+                <w:del w:id="1020" w:author="Courtwork" w:date="2026-07-09T00:00:00.000Z"/>
               </w:rPr>
             </w:pPr>
-            <w:del w:id="1019" w:author="Courtwork" w:date="2026-07-09T10:00:00.000Z">
+            <w:del w:id="1019" w:author="Courtwork" w:date="2026-07-09T00:00:00.000Z">
               <w:r>
                 <w:rPr>
-                  <w:rFonts w:ascii="Times New Roman" w:eastAsia="仿宋_GB2312" w:hAnsi="Times New Roman"/>
+                  <w:rFonts w:ascii="Times New Roman" w:eastAsia="仿宋_GB2312" w:hAnsi="Times New Roman" w:cs="Times New Roman"/>
                 </w:rPr>
                 <w:delText xml:space="preserve">验收合格之日起10日内</w:delText>
               </w:r>
@@ -339,6 +395,7 @@
     <w:p>
       <w:r>
         <w:rPr>
+          <w:rFonts w:ascii="Times New Roman" w:eastAsia="黑体" w:hAnsi="Times New Roman" w:cs="Times New Roman"/>
           <w:b/>
         </w:rPr>
         <w:t>第五条 质量保证</w:t>
@@ -347,34 +404,37 @@
     <w:p>
       <w:r>
         <w:rPr>
-          <w:rFonts w:ascii="Times New Roman" w:eastAsia="仿宋_GB2312" w:hAnsi="Times New Roman"/>
+          <w:rFonts w:ascii="Times New Roman" w:eastAsia="仿宋_GB2312" w:hAnsi="Times New Roman" w:cs="Times New Roman"/>
         </w:rPr>
         <w:t xml:space="preserve">乙方保证标的物符合国家相关质量标准，质保期为交付之日起</w:t>
       </w:r>
-      <w:del w:id="1007" w:author="Courtwork" w:date="2026-07-09T10:00:00.000Z">
+      <w:del w:id="1007" w:author="Courtwork" w:date="2026-07-09T00:00:00.000Z">
         <w:r>
           <w:rPr>
-            <w:rFonts w:ascii="Times New Roman" w:eastAsia="仿宋_GB2312" w:hAnsi="Times New Roman"/>
+            <w:rFonts w:ascii="Times New Roman" w:eastAsia="仿宋_GB2312" w:hAnsi="Times New Roman" w:cs="Times New Roman"/>
           </w:rPr>
           <w:delText xml:space="preserve">壹</w:delText>
         </w:r>
       </w:del>
       <w:commentRangeStart w:id="4"/>
-      <w:ins w:id="1008" w:author="Courtwork" w:date="2026-07-09T10:00:00.000Z">
+      <w:ins w:id="1008" w:author="Courtwork" w:date="2026-07-09T00:00:00.000Z">
         <w:r>
           <w:rPr>
-            <w:rFonts w:ascii="Times New Roman" w:eastAsia="仿宋_GB2312" w:hAnsi="Times New Roman"/>
+            <w:rFonts w:ascii="Times New Roman" w:eastAsia="仿宋_GB2312" w:hAnsi="Times New Roman" w:cs="Times New Roman"/>
           </w:rPr>
           <w:t xml:space="preserve">贰</w:t>
         </w:r>
       </w:ins>
       <w:commentRangeEnd w:id="4"/>
       <w:r>
+        <w:rPr>
+          <w:rFonts w:ascii="Times New Roman" w:eastAsia="仿宋_GB2312" w:hAnsi="Times New Roman" w:cs="Times New Roman"/>
+        </w:rPr>
         <w:commentReference w:id="4"/>
       </w:r>
       <w:r>
         <w:rPr>
-          <w:rFonts w:ascii="Times New Roman" w:eastAsia="仿宋_GB2312" w:hAnsi="Times New Roman"/>
+          <w:rFonts w:ascii="Times New Roman" w:eastAsia="仿宋_GB2312" w:hAnsi="Times New Roman" w:cs="Times New Roman"/>
         </w:rPr>
         <w:t xml:space="preserve">年。</w:t>
       </w:r>
@@ -382,6 +442,7 @@
     <w:p>
       <w:r>
         <w:rPr>
+          <w:rFonts w:ascii="Times New Roman" w:eastAsia="黑体" w:hAnsi="Times New Roman" w:cs="Times New Roman"/>
           <w:b/>
         </w:rPr>
         <w:t>第六条 违约责任</w:t>
@@ -390,26 +451,29 @@
     <w:p>
       <w:r>
         <w:rPr>
-          <w:rFonts w:ascii="Times New Roman" w:eastAsia="仿宋_GB2312" w:hAnsi="Times New Roman"/>
+          <w:rFonts w:ascii="Times New Roman" w:eastAsia="仿宋_GB2312" w:hAnsi="Times New Roman" w:cs="Times New Roman"/>
         </w:rPr>
         <w:t xml:space="preserve">任何一方违反本合同约定，应向守约方支付合同总价款百分之十</w:t>
       </w:r>
       <w:commentRangeStart w:id="0"/>
-      <w:ins w:id="1000" w:author="Courtwork" w:date="2026-07-09T10:00:00.000Z">
+      <w:ins w:id="1000" w:author="Courtwork" w:date="2026-07-09T00:00:00.000Z">
         <w:r>
           <w:rPr>
-            <w:rFonts w:ascii="Times New Roman" w:eastAsia="仿宋_GB2312" w:hAnsi="Times New Roman"/>
+            <w:rFonts w:ascii="Times New Roman" w:eastAsia="仿宋_GB2312" w:hAnsi="Times New Roman" w:cs="Times New Roman"/>
           </w:rPr>
           <w:t xml:space="preserve">五</w:t>
         </w:r>
       </w:ins>
       <w:commentRangeEnd w:id="0"/>
       <w:r>
+        <w:rPr>
+          <w:rFonts w:ascii="Times New Roman" w:eastAsia="仿宋_GB2312" w:hAnsi="Times New Roman" w:cs="Times New Roman"/>
+        </w:rPr>
         <w:commentReference w:id="0"/>
       </w:r>
       <w:r>
         <w:rPr>
-          <w:rFonts w:ascii="Times New Roman" w:eastAsia="仿宋_GB2312" w:hAnsi="Times New Roman"/>
+          <w:rFonts w:ascii="Times New Roman" w:eastAsia="仿宋_GB2312" w:hAnsi="Times New Roman" w:cs="Times New Roman"/>
         </w:rPr>
         <w:t xml:space="preserve">的违约金。</w:t>
       </w:r>
@@ -417,6 +481,7 @@
     <w:p>
       <w:r>
         <w:rPr>
+          <w:rFonts w:ascii="Times New Roman" w:eastAsia="黑体" w:hAnsi="Times New Roman" w:cs="Times New Roman"/>
           <w:b/>
         </w:rPr>
         <w:t>第七条 争议解决</w:t>
@@ -425,34 +490,37 @@
     <w:p>
       <w:r>
         <w:rPr>
-          <w:rFonts w:ascii="Times New Roman" w:eastAsia="仿宋_GB2312" w:hAnsi="Times New Roman"/>
+          <w:rFonts w:ascii="Times New Roman" w:eastAsia="仿宋_GB2312" w:hAnsi="Times New Roman" w:cs="Times New Roman"/>
         </w:rPr>
         <w:t xml:space="preserve">因本合同引起的争议，双方应协商解决；协商不成的，提交</w:t>
       </w:r>
-      <w:del w:id="1009" w:author="Courtwork" w:date="2026-07-09T10:00:00.000Z">
+      <w:del w:id="1009" w:author="Courtwork" w:date="2026-07-09T00:00:00.000Z">
         <w:r>
           <w:rPr>
-            <w:rFonts w:ascii="Times New Roman" w:eastAsia="仿宋_GB2312" w:hAnsi="Times New Roman"/>
+            <w:rFonts w:ascii="Times New Roman" w:eastAsia="仿宋_GB2312" w:hAnsi="Times New Roman" w:cs="Times New Roman"/>
           </w:rPr>
           <w:delText xml:space="preserve">甲方</w:delText>
         </w:r>
       </w:del>
       <w:commentRangeStart w:id="5"/>
-      <w:ins w:id="1010" w:author="Courtwork" w:date="2026-07-09T10:00:00.000Z">
+      <w:ins w:id="1010" w:author="Courtwork" w:date="2026-07-09T00:00:00.000Z">
         <w:r>
           <w:rPr>
-            <w:rFonts w:ascii="Times New Roman" w:eastAsia="仿宋_GB2312" w:hAnsi="Times New Roman"/>
+            <w:rFonts w:ascii="Times New Roman" w:eastAsia="仿宋_GB2312" w:hAnsi="Times New Roman" w:cs="Times New Roman"/>
           </w:rPr>
           <w:t xml:space="preserve">标的物</w:t>
         </w:r>
       </w:ins>
       <w:commentRangeEnd w:id="5"/>
       <w:r>
+        <w:rPr>
+          <w:rFonts w:ascii="Times New Roman" w:eastAsia="仿宋_GB2312" w:hAnsi="Times New Roman" w:cs="Times New Roman"/>
+        </w:rPr>
         <w:commentReference w:id="5"/>
       </w:r>
       <w:r>
         <w:rPr>
-          <w:rFonts w:ascii="Times New Roman" w:eastAsia="仿宋_GB2312" w:hAnsi="Times New Roman"/>
+          <w:rFonts w:ascii="Times New Roman" w:eastAsia="仿宋_GB2312" w:hAnsi="Times New Roman" w:cs="Times New Roman"/>
         </w:rPr>
         <w:t xml:space="preserve">所在地人民法院诉讼解决。</w:t>
       </w:r>
@@ -460,26 +528,30 @@
     <w:p>
       <w:pPr>
         <w:rPr>
-          <w:ins w:id="1002" w:author="Courtwork" w:date="2026-07-09T10:00:00.000Z"/>
+          <w:ins w:id="1002" w:author="Courtwork" w:date="2026-07-09T00:00:00.000Z"/>
         </w:rPr>
       </w:pPr>
       <w:commentRangeStart w:id="1"/>
-      <w:ins w:id="1001" w:author="Courtwork" w:date="2026-07-09T10:00:00.000Z">
+      <w:ins w:id="1001" w:author="Courtwork" w:date="2026-07-09T00:00:00.000Z">
         <w:r>
           <w:rPr>
-            <w:rFonts w:ascii="Times New Roman" w:eastAsia="仿宋_GB2312" w:hAnsi="Times New Roman"/>
+            <w:rFonts w:ascii="Times New Roman" w:eastAsia="仿宋_GB2312" w:hAnsi="Times New Roman" w:cs="Times New Roman"/>
           </w:rPr>
           <w:t xml:space="preserve">第七条之一 保密条款 双方对本合同履行过程中知悉的对方商业秘密负有保密义务，未经对方书面同意不得向第三方披露。</w:t>
         </w:r>
       </w:ins>
       <w:commentRangeEnd w:id="1"/>
       <w:r>
+        <w:rPr>
+          <w:rFonts w:ascii="Times New Roman" w:eastAsia="仿宋_GB2312" w:hAnsi="Times New Roman" w:cs="Times New Roman"/>
+        </w:rPr>
         <w:commentReference w:id="1"/>
       </w:r>
     </w:p>
     <w:p>
       <w:r>
         <w:rPr>
+          <w:rFonts w:ascii="Times New Roman" w:eastAsia="黑体" w:hAnsi="Times New Roman" w:cs="Times New Roman"/>
           <w:b/>
         </w:rPr>
         <w:t>第八条 其他约定</w:t>
@@ -489,30 +561,39 @@
       <w:commentRangeStart w:id="2"/>
       <w:pPr>
         <w:rPr>
-          <w:del w:id="1004" w:author="Courtwork" w:date="2026-07-09T10:00:00.000Z"/>
+          <w:del w:id="1004" w:author="Courtwork" w:date="2026-07-09T00:00:00.000Z"/>
         </w:rPr>
       </w:pPr>
-      <w:del w:id="1003" w:author="Courtwork" w:date="2026-07-09T10:00:00.000Z">
+      <w:del w:id="1003" w:author="Courtwork" w:date="2026-07-09T00:00:00.000Z">
         <w:r>
           <w:rPr>
-            <w:rFonts w:ascii="Times New Roman" w:eastAsia="仿宋_GB2312" w:hAnsi="Times New Roman"/>
+            <w:rFonts w:ascii="Times New Roman" w:eastAsia="仿宋_GB2312" w:hAnsi="Times New Roman" w:cs="Times New Roman"/>
           </w:rPr>
           <w:delText xml:space="preserve">本合同一式两份，甲乙双方各执一份，自双方签字盖章之日起生效。</w:delText>
         </w:r>
       </w:del>
       <w:commentRangeEnd w:id="2"/>
       <w:r>
+        <w:rPr>
+          <w:rFonts w:ascii="Times New Roman" w:eastAsia="仿宋_GB2312" w:hAnsi="Times New Roman" w:cs="Times New Roman"/>
+        </w:rPr>
         <w:commentReference w:id="2"/>
       </w:r>
     </w:p>
     <w:p/>
     <w:p>
       <w:r>
+        <w:rPr>
+          <w:rFonts w:ascii="Times New Roman" w:eastAsia="仿宋_GB2312" w:hAnsi="Times New Roman" w:cs="Times New Roman"/>
+        </w:rPr>
         <w:t>甲方（盖章）：__________          乙方（盖章）：__________</w:t>
       </w:r>
     </w:p>
     <w:p>
       <w:r>
+        <w:rPr>
+          <w:rFonts w:ascii="Times New Roman" w:eastAsia="仿宋_GB2312" w:hAnsi="Times New Roman" w:cs="Times New Roman"/>
+        </w:rPr>
         <w:t>签订日期：__________              签订日期：__________</w:t>
       </w:r>
     </w:p>
@@ -528,72 +609,102 @@
 
 <file path=word/comments.xml><?xml version="1.0" encoding="utf-8"?>
 <w:comments xmlns:w="http://schemas.openxmlformats.org/wordprocessingml/2006/main">
-  <w:comment w:id="0" w:author="Courtwork" w:date="2026-07-09T10:00:00.000Z" w:initials="CW">
+  <w:comment w:id="0" w:author="Courtwork" w:date="2026-07-09T00:00:00.000Z" w:initials="CW">
     <w:p>
       <w:r>
+        <w:rPr>
+          <w:rFonts w:ascii="Times New Roman" w:eastAsia="仿宋_GB2312" w:hAnsi="Times New Roman" w:cs="Times New Roman"/>
+        </w:rPr>
         <w:t>违约金比例建议上调，与本所同类合同模板对齐。</w:t>
       </w:r>
     </w:p>
   </w:comment>
-  <w:comment w:id="1" w:author="Courtwork" w:date="2026-07-09T10:00:00.000Z" w:initials="CW">
+  <w:comment w:id="1" w:author="Courtwork" w:date="2026-07-09T00:00:00.000Z" w:initials="CW">
     <w:p>
       <w:r>
+        <w:rPr>
+          <w:rFonts w:ascii="Times New Roman" w:eastAsia="仿宋_GB2312" w:hAnsi="Times New Roman" w:cs="Times New Roman"/>
+        </w:rPr>
         <w:t>补充保密条款，原合同缺失该项约定。</w:t>
       </w:r>
     </w:p>
   </w:comment>
-  <w:comment w:id="2" w:author="Courtwork" w:date="2026-07-09T10:00:00.000Z" w:initials="CW">
+  <w:comment w:id="2" w:author="Courtwork" w:date="2026-07-09T00:00:00.000Z" w:initials="CW">
     <w:p>
       <w:r>
+        <w:rPr>
+          <w:rFonts w:ascii="Times New Roman" w:eastAsia="仿宋_GB2312" w:hAnsi="Times New Roman" w:cs="Times New Roman"/>
+        </w:rPr>
         <w:t>该条内容并入合同尾部通用条款，此处删除避免重复。</w:t>
       </w:r>
     </w:p>
   </w:comment>
-  <w:comment w:id="3" w:author="Courtwork" w:date="2026-07-09T10:00:00.000Z" w:initials="CW">
+  <w:comment w:id="3" w:author="Courtwork" w:date="2026-07-09T00:00:00.000Z" w:initials="CW">
     <w:p>
       <w:r>
+        <w:rPr>
+          <w:rFonts w:ascii="Times New Roman" w:eastAsia="仿宋_GB2312" w:hAnsi="Times New Roman" w:cs="Times New Roman"/>
+        </w:rPr>
         <w:t>首期付款比例下调，与甲方财务部沟通后调整。</w:t>
       </w:r>
     </w:p>
   </w:comment>
-  <w:comment w:id="4" w:author="Courtwork" w:date="2026-07-09T10:00:00.000Z" w:initials="CW">
+  <w:comment w:id="4" w:author="Courtwork" w:date="2026-07-09T00:00:00.000Z" w:initials="CW">
     <w:p>
       <w:r>
+        <w:rPr>
+          <w:rFonts w:ascii="Times New Roman" w:eastAsia="仿宋_GB2312" w:hAnsi="Times New Roman" w:cs="Times New Roman"/>
+        </w:rPr>
         <w:t>质保期建议延长至两年，参考同类设备行业惯例。</w:t>
       </w:r>
     </w:p>
   </w:comment>
-  <w:comment w:id="5" w:author="Courtwork" w:date="2026-07-09T10:00:00.000Z" w:initials="CW">
+  <w:comment w:id="5" w:author="Courtwork" w:date="2026-07-09T00:00:00.000Z" w:initials="CW">
     <w:p>
       <w:r>
+        <w:rPr>
+          <w:rFonts w:ascii="Times New Roman" w:eastAsia="仿宋_GB2312" w:hAnsi="Times New Roman" w:cs="Times New Roman"/>
+        </w:rPr>
         <w:t>管辖法院建议改为标的物所在地，便于纠纷发生时勘验现场设备。</w:t>
       </w:r>
     </w:p>
   </w:comment>
-  <w:comment w:id="6" w:author="Courtwork" w:date="2026-07-09T10:00:00.000Z" w:initials="CW">
+  <w:comment w:id="6" w:author="Courtwork" w:date="2026-07-09T00:00:00.000Z" w:initials="CW">
     <w:p>
       <w:r>
+        <w:rPr>
+          <w:rFonts w:ascii="Times New Roman" w:eastAsia="仿宋_GB2312" w:hAnsi="Times New Roman" w:cs="Times New Roman"/>
+        </w:rPr>
         <w:t>请核实附表一是否已作为合同附件一并签署，本次送审文本未见附表。</w:t>
       </w:r>
     </w:p>
   </w:comment>
-  <w:comment w:id="7" w:author="Courtwork" w:date="2026-07-09T10:00:00.000Z" w:initials="CW">
+  <w:comment w:id="7" w:author="Courtwork" w:date="2026-07-09T00:00:00.000Z" w:initials="CW">
     <w:p>
       <w:r>
+        <w:rPr>
+          <w:rFonts w:ascii="Times New Roman" w:eastAsia="仿宋_GB2312" w:hAnsi="Times New Roman" w:cs="Times New Roman"/>
+        </w:rPr>
         <w:t>交付期限延长，乙方反馈设备生产周期需要更多时间。</w:t>
       </w:r>
     </w:p>
   </w:comment>
-  <w:comment w:id="8" w:author="Courtwork" w:date="2026-07-09T10:00:00.000Z" w:initials="CW">
+  <w:comment w:id="8" w:author="Courtwork" w:date="2026-07-09T00:00:00.000Z" w:initials="CW">
     <w:p>
       <w:r>
+        <w:rPr>
+          <w:rFonts w:ascii="Times New Roman" w:eastAsia="仿宋_GB2312" w:hAnsi="Times New Roman" w:cs="Times New Roman"/>
+        </w:rPr>
         <w:t>核对营业执照后更正甲方全称（有限公司→股份有限公司）。</w:t>
       </w:r>
     </w:p>
   </w:comment>
-  <w:comment w:id="9" w:author="Courtwork" w:date="2026-07-09T10:00:00.000Z" w:initials="CW">
+  <w:comment w:id="9" w:author="Courtwork" w:date="2026-07-09T00:00:00.000Z" w:initials="CW">
     <w:p>
       <w:r>
+        <w:rPr>
+          <w:rFonts w:ascii="Times New Roman" w:eastAsia="仿宋_GB2312" w:hAnsi="Times New Roman" w:cs="Times New Roman"/>
+        </w:rPr>
         <w:t>第三期验收付款并入第二期一次性支付，删除该行。</w:t>
       </w:r>
     </w:p>

</xml_diff>